<commit_message>
Update game brush kanj challenge
</commit_message>
<xml_diff>
--- a/Games tambahan tapi blm di build.docx
+++ b/Games tambahan tapi blm di build.docx
@@ -4,17 +4,15 @@
   <w:body>
     <w:p>
       <w:pPr>
+        <w:pStyle w:val="ListParagraph"/>
+        <w:numPr>
+          <w:ilvl w:val="0"/>
+          <w:numId w:val="2"/>
+        </w:numPr>
         <w:rPr>
           <w:lang w:val="sv-SE"/>
         </w:rPr>
       </w:pPr>
-      <w:r>
-        <w:rPr>
-          <w:b/>
-          <w:bCs/>
-        </w:rPr>
-        <w:t xml:space="preserve">1. </w:t>
-      </w:r>
       <w:r>
         <w:rPr>
           <w:rFonts w:ascii="Segoe UI Emoji" w:hAnsi="Segoe UI Emoji" w:cs="Segoe UI Emoji"/>
@@ -307,18 +305,15 @@
     </w:p>
     <w:p>
       <w:pPr>
+        <w:pStyle w:val="ListParagraph"/>
+        <w:numPr>
+          <w:ilvl w:val="0"/>
+          <w:numId w:val="2"/>
+        </w:numPr>
         <w:rPr>
           <w:lang w:val="sv-SE"/>
         </w:rPr>
       </w:pPr>
-      <w:r>
-        <w:rPr>
-          <w:b/>
-          <w:bCs/>
-          <w:lang w:val="sv-SE"/>
-        </w:rPr>
-        <w:t xml:space="preserve">2. </w:t>
-      </w:r>
       <w:r>
         <w:rPr>
           <w:rFonts w:ascii="Segoe UI Emoji" w:hAnsi="Segoe UI Emoji" w:cs="Segoe UI Emoji"/>
@@ -377,10 +372,30 @@
     </w:p>
     <w:p>
       <w:pPr>
+        <w:pStyle w:val="ListParagraph"/>
+        <w:numPr>
+          <w:ilvl w:val="0"/>
+          <w:numId w:val="2"/>
+        </w:numPr>
         <w:rPr>
           <w:lang w:val="sv-SE"/>
         </w:rPr>
       </w:pPr>
+      <w:r>
+        <w:rPr>
+          <w:b/>
+          <w:bCs/>
+          <w:lang w:val="sv-SE"/>
+        </w:rPr>
+        <w:t>Omikuji Gacha Wheel</w:t>
+      </w:r>
+      <w:r>
+        <w:rPr>
+          <w:lang w:val="sv-SE"/>
+        </w:rPr>
+        <w:br/>
+        <w:t>Roda undian berputar (isinya hadiah dari common sampai SSR — photocard langka member), pemain klik sekali untuk "spin", lalu ada momen suspense (roda melambat) sebelum reveal hasil dengan confetti + cahaya lentera kalau dapat rare. Mekanik paling simpel dari semua (cuma 1 klik + animasi), tapi efek dopamine/surprise-nya tinggi — cocok kalau kamu mau sesuatu yang gampang dimainkan tapi tetap memorable.</w:t>
+      </w:r>
     </w:p>
     <w:sectPr>
       <w:pgSz w:w="11906" w:h="16838"/>
@@ -390,6 +405,193 @@
     </w:sectPr>
   </w:body>
 </w:document>
+</file>
+
+<file path=word/numbering.xml><?xml version="1.0" encoding="utf-8"?>
+<w:numbering xmlns:wpc="http://schemas.microsoft.com/office/word/2010/wordprocessingCanvas" xmlns:cx="http://schemas.microsoft.com/office/drawing/2014/chartex" xmlns:cx1="http://schemas.microsoft.com/office/drawing/2015/9/8/chartex" xmlns:cx2="http://schemas.microsoft.com/office/drawing/2015/10/21/chartex" xmlns:cx3="http://schemas.microsoft.com/office/drawing/2016/5/9/chartex" xmlns:cx4="http://schemas.microsoft.com/office/drawing/2016/5/10/chartex" xmlns:cx5="http://schemas.microsoft.com/office/drawing/2016/5/11/chartex" xmlns:cx6="http://schemas.microsoft.com/office/drawing/2016/5/12/chartex" xmlns:cx7="http://schemas.microsoft.com/office/drawing/2016/5/13/chartex" xmlns:cx8="http://schemas.microsoft.com/office/drawing/2016/5/14/chartex" xmlns:mc="http://schemas.openxmlformats.org/markup-compatibility/2006" xmlns:aink="http://schemas.microsoft.com/office/drawing/2016/ink" xmlns:am3d="http://schemas.microsoft.com/office/drawing/2017/model3d" xmlns:o="urn:schemas-microsoft-com:office:office" xmlns:oel="http://schemas.microsoft.com/office/2019/extlst" xmlns:r="http://schemas.openxmlformats.org/officeDocument/2006/relationships" xmlns:m="http://schemas.openxmlformats.org/officeDocument/2006/math" xmlns:v="urn:schemas-microsoft-com:vml" xmlns:wp14="http://schemas.microsoft.com/office/word/2010/wordprocessingDrawing" xmlns:wp="http://schemas.openxmlformats.org/drawingml/2006/wordprocessingDrawing" xmlns:w10="urn:schemas-microsoft-com:office:word" xmlns:w="http://schemas.openxmlformats.org/wordprocessingml/2006/main" xmlns:w14="http://schemas.microsoft.com/office/word/2010/wordml" xmlns:w15="http://schemas.microsoft.com/office/word/2012/wordml" xmlns:w16cei="http://schemas.microsoft.com/office/word/2026/wordml/cei" xmlns:w16cex="http://schemas.microsoft.com/office/word/2018/wordml/cex" xmlns:w16cid="http://schemas.microsoft.com/office/word/2016/wordml/cid" xmlns:w16="http://schemas.microsoft.com/office/word/2018/wordml" xmlns:w16du="http://schemas.microsoft.com/office/word/2023/wordml/word16du" xmlns:w16sdtdh="http://schemas.microsoft.com/office/word/2020/wordml/sdtdatahash" xmlns:w16sdtfl="http://schemas.microsoft.com/office/word/2024/wordml/sdtformatlock" xmlns:w16se="http://schemas.microsoft.com/office/word/2015/wordml/symex" xmlns:wpg="http://schemas.microsoft.com/office/word/2010/wordprocessingGroup" xmlns:wpi="http://schemas.microsoft.com/office/word/2010/wordprocessingInk" xmlns:wne="http://schemas.microsoft.com/office/word/2006/wordml" xmlns:wps="http://schemas.microsoft.com/office/word/2010/wordprocessingShape" mc:Ignorable="w14 w15 w16se w16cid w16 w16cex w16sdtdh w16sdtfl w16du wp14">
+  <w:abstractNum w:abstractNumId="0" w15:restartNumberingAfterBreak="0">
+    <w:nsid w:val="1F344997"/>
+    <w:multiLevelType w:val="hybridMultilevel"/>
+    <w:tmpl w:val="2542E09A"/>
+    <w:lvl w:ilvl="0" w:tplc="FB3A8C4E">
+      <w:start w:val="1"/>
+      <w:numFmt w:val="decimal"/>
+      <w:lvlText w:val="%1."/>
+      <w:lvlJc w:val="left"/>
+      <w:pPr>
+        <w:ind w:left="720" w:hanging="360"/>
+      </w:pPr>
+      <w:rPr>
+        <w:rFonts w:hint="default"/>
+        <w:b/>
+      </w:rPr>
+    </w:lvl>
+    <w:lvl w:ilvl="1" w:tplc="38090019" w:tentative="1">
+      <w:start w:val="1"/>
+      <w:numFmt w:val="lowerLetter"/>
+      <w:lvlText w:val="%2."/>
+      <w:lvlJc w:val="left"/>
+      <w:pPr>
+        <w:ind w:left="1440" w:hanging="360"/>
+      </w:pPr>
+    </w:lvl>
+    <w:lvl w:ilvl="2" w:tplc="3809001B" w:tentative="1">
+      <w:start w:val="1"/>
+      <w:numFmt w:val="lowerRoman"/>
+      <w:lvlText w:val="%3."/>
+      <w:lvlJc w:val="right"/>
+      <w:pPr>
+        <w:ind w:left="2160" w:hanging="180"/>
+      </w:pPr>
+    </w:lvl>
+    <w:lvl w:ilvl="3" w:tplc="3809000F" w:tentative="1">
+      <w:start w:val="1"/>
+      <w:numFmt w:val="decimal"/>
+      <w:lvlText w:val="%4."/>
+      <w:lvlJc w:val="left"/>
+      <w:pPr>
+        <w:ind w:left="2880" w:hanging="360"/>
+      </w:pPr>
+    </w:lvl>
+    <w:lvl w:ilvl="4" w:tplc="38090019" w:tentative="1">
+      <w:start w:val="1"/>
+      <w:numFmt w:val="lowerLetter"/>
+      <w:lvlText w:val="%5."/>
+      <w:lvlJc w:val="left"/>
+      <w:pPr>
+        <w:ind w:left="3600" w:hanging="360"/>
+      </w:pPr>
+    </w:lvl>
+    <w:lvl w:ilvl="5" w:tplc="3809001B" w:tentative="1">
+      <w:start w:val="1"/>
+      <w:numFmt w:val="lowerRoman"/>
+      <w:lvlText w:val="%6."/>
+      <w:lvlJc w:val="right"/>
+      <w:pPr>
+        <w:ind w:left="4320" w:hanging="180"/>
+      </w:pPr>
+    </w:lvl>
+    <w:lvl w:ilvl="6" w:tplc="3809000F" w:tentative="1">
+      <w:start w:val="1"/>
+      <w:numFmt w:val="decimal"/>
+      <w:lvlText w:val="%7."/>
+      <w:lvlJc w:val="left"/>
+      <w:pPr>
+        <w:ind w:left="5040" w:hanging="360"/>
+      </w:pPr>
+    </w:lvl>
+    <w:lvl w:ilvl="7" w:tplc="38090019" w:tentative="1">
+      <w:start w:val="1"/>
+      <w:numFmt w:val="lowerLetter"/>
+      <w:lvlText w:val="%8."/>
+      <w:lvlJc w:val="left"/>
+      <w:pPr>
+        <w:ind w:left="5760" w:hanging="360"/>
+      </w:pPr>
+    </w:lvl>
+    <w:lvl w:ilvl="8" w:tplc="3809001B" w:tentative="1">
+      <w:start w:val="1"/>
+      <w:numFmt w:val="lowerRoman"/>
+      <w:lvlText w:val="%9."/>
+      <w:lvlJc w:val="right"/>
+      <w:pPr>
+        <w:ind w:left="6480" w:hanging="180"/>
+      </w:pPr>
+    </w:lvl>
+  </w:abstractNum>
+  <w:abstractNum w:abstractNumId="1" w15:restartNumberingAfterBreak="0">
+    <w:nsid w:val="32D42C25"/>
+    <w:multiLevelType w:val="hybridMultilevel"/>
+    <w:tmpl w:val="730ADC22"/>
+    <w:lvl w:ilvl="0" w:tplc="3809000F">
+      <w:start w:val="1"/>
+      <w:numFmt w:val="decimal"/>
+      <w:lvlText w:val="%1."/>
+      <w:lvlJc w:val="left"/>
+      <w:pPr>
+        <w:ind w:left="720" w:hanging="360"/>
+      </w:pPr>
+    </w:lvl>
+    <w:lvl w:ilvl="1" w:tplc="38090019" w:tentative="1">
+      <w:start w:val="1"/>
+      <w:numFmt w:val="lowerLetter"/>
+      <w:lvlText w:val="%2."/>
+      <w:lvlJc w:val="left"/>
+      <w:pPr>
+        <w:ind w:left="1440" w:hanging="360"/>
+      </w:pPr>
+    </w:lvl>
+    <w:lvl w:ilvl="2" w:tplc="3809001B" w:tentative="1">
+      <w:start w:val="1"/>
+      <w:numFmt w:val="lowerRoman"/>
+      <w:lvlText w:val="%3."/>
+      <w:lvlJc w:val="right"/>
+      <w:pPr>
+        <w:ind w:left="2160" w:hanging="180"/>
+      </w:pPr>
+    </w:lvl>
+    <w:lvl w:ilvl="3" w:tplc="3809000F" w:tentative="1">
+      <w:start w:val="1"/>
+      <w:numFmt w:val="decimal"/>
+      <w:lvlText w:val="%4."/>
+      <w:lvlJc w:val="left"/>
+      <w:pPr>
+        <w:ind w:left="2880" w:hanging="360"/>
+      </w:pPr>
+    </w:lvl>
+    <w:lvl w:ilvl="4" w:tplc="38090019" w:tentative="1">
+      <w:start w:val="1"/>
+      <w:numFmt w:val="lowerLetter"/>
+      <w:lvlText w:val="%5."/>
+      <w:lvlJc w:val="left"/>
+      <w:pPr>
+        <w:ind w:left="3600" w:hanging="360"/>
+      </w:pPr>
+    </w:lvl>
+    <w:lvl w:ilvl="5" w:tplc="3809001B" w:tentative="1">
+      <w:start w:val="1"/>
+      <w:numFmt w:val="lowerRoman"/>
+      <w:lvlText w:val="%6."/>
+      <w:lvlJc w:val="right"/>
+      <w:pPr>
+        <w:ind w:left="4320" w:hanging="180"/>
+      </w:pPr>
+    </w:lvl>
+    <w:lvl w:ilvl="6" w:tplc="3809000F" w:tentative="1">
+      <w:start w:val="1"/>
+      <w:numFmt w:val="decimal"/>
+      <w:lvlText w:val="%7."/>
+      <w:lvlJc w:val="left"/>
+      <w:pPr>
+        <w:ind w:left="5040" w:hanging="360"/>
+      </w:pPr>
+    </w:lvl>
+    <w:lvl w:ilvl="7" w:tplc="38090019" w:tentative="1">
+      <w:start w:val="1"/>
+      <w:numFmt w:val="lowerLetter"/>
+      <w:lvlText w:val="%8."/>
+      <w:lvlJc w:val="left"/>
+      <w:pPr>
+        <w:ind w:left="5760" w:hanging="360"/>
+      </w:pPr>
+    </w:lvl>
+    <w:lvl w:ilvl="8" w:tplc="3809001B" w:tentative="1">
+      <w:start w:val="1"/>
+      <w:numFmt w:val="lowerRoman"/>
+      <w:lvlText w:val="%9."/>
+      <w:lvlJc w:val="right"/>
+      <w:pPr>
+        <w:ind w:left="6480" w:hanging="180"/>
+      </w:pPr>
+    </w:lvl>
+  </w:abstractNum>
+  <w:num w:numId="1" w16cid:durableId="604732772">
+    <w:abstractNumId w:val="1"/>
+  </w:num>
+  <w:num w:numId="2" w16cid:durableId="1304853461">
+    <w:abstractNumId w:val="0"/>
+  </w:num>
+</w:numbering>
 </file>
 
 <file path=word/styles.xml><?xml version="1.0" encoding="utf-8"?>

</xml_diff>